<commit_message>
Assignment 6 - Regular Expressions
</commit_message>
<xml_diff>
--- a/Programming_exercise_6/MariaGalante_ProgrammingExercise_6.docx
+++ b/Programming_exercise_6/MariaGalante_ProgrammingExercise_6.docx
@@ -34,7 +34,10 @@
       </w:r>
       <w:r>
         <w:br/>
-        <w:t># Program Description: This program uses regular expressions to validate phone numbers, social security numbers, and ZIP codes entered by the user. The program contains separate functions for each validation and displays whether the input is valid or invalid.</w:t>
+        <w:t># Program Description: This program uses regular expressions to validate phone numbers, social security numbers, and ZIP codes entered by the user. The program contains separate functions for each validation and displays whether the input is valid or invalid</w:t>
+      </w:r>
+      <w:r>
+        <w:t>.</w:t>
       </w:r>
       <w:r>
         <w:br/>
@@ -1179,6 +1182,7 @@
   <w:style w:type="character" w:default="1" w:styleId="DefaultParagraphFont">
     <w:name w:val="Default Paragraph Font"/>
     <w:uiPriority w:val="1"/>
+    <w:semiHidden/>
     <w:unhideWhenUsed/>
   </w:style>
   <w:style w:type="table" w:default="1" w:styleId="TableNormal">

</xml_diff>